<commit_message>
updated requirements and template
</commit_message>
<xml_diff>
--- a/GenAI/DataModeling_Requirements_Template.docx
+++ b/GenAI/DataModeling_Requirements_Template.docx
@@ -24,12 +24,6 @@
         <w:gridCol w:w="14878"/>
       </w:tblGrid>
       <w:tr>
-        <w:tblPrEx>
-          <w:tblCellMar>
-            <w:top w:w="0" w:type="dxa"/>
-            <w:bottom w:w="0" w:type="dxa"/>
-          </w:tblCellMar>
-        </w:tblPrEx>
         <w:tc>
           <w:tcPr>
             <w:tcW w:w="560" w:type="dxa"/>
@@ -39,7 +33,7 @@
               <w:bottom w:val="none" w:sz="0" w:space="0" w:color="FFFFFF"/>
               <w:right w:val="none" w:sz="0" w:space="0" w:color="FFFFFF"/>
             </w:tcBorders>
-            <w:shd w:val="clear" w:color="auto" w:fill="E85D04"/>
+            <w:shd w:val="clear" w:color="auto" w:fill="4C94D8" w:themeFill="text2" w:themeFillTint="80"/>
             <w:tcMar>
               <w:top w:w="52" w:type="dxa"/>
               <w:left w:w="108" w:type="dxa"/>
@@ -47,6 +41,7 @@
               <w:right w:w="108" w:type="dxa"/>
             </w:tcMar>
           </w:tcPr>
+          <w:p/>
           <w:p/>
         </w:tc>
         <w:tc>
@@ -90,7 +85,29 @@
                 <w:sz w:val="17"/>
                 <w:szCs w:val="17"/>
               </w:rPr>
-              <w:t>Scoping document — complete before each modeling sprint  (A4 landscape, print double-sided)</w:t>
+              <w:t xml:space="preserve">Scoping document — complete before each modeling </w:t>
+            </w:r>
+            <w:proofErr w:type="gramStart"/>
+            <w:r>
+              <w:rPr>
+                <w:i/>
+                <w:iCs/>
+                <w:color w:val="64748B"/>
+                <w:sz w:val="17"/>
+                <w:szCs w:val="17"/>
+              </w:rPr>
+              <w:t>sprint  (</w:t>
+            </w:r>
+            <w:proofErr w:type="gramEnd"/>
+            <w:r>
+              <w:rPr>
+                <w:i/>
+                <w:iCs/>
+                <w:color w:val="64748B"/>
+                <w:sz w:val="17"/>
+                <w:szCs w:val="17"/>
+              </w:rPr>
+              <w:t>A4 landscape, print double-sided)</w:t>
             </w:r>
           </w:p>
         </w:tc>
@@ -123,12 +140,6 @@
         <w:gridCol w:w="8820"/>
       </w:tblGrid>
       <w:tr>
-        <w:tblPrEx>
-          <w:tblCellMar>
-            <w:top w:w="0" w:type="dxa"/>
-            <w:bottom w:w="0" w:type="dxa"/>
-          </w:tblCellMar>
-        </w:tblPrEx>
         <w:tc>
           <w:tcPr>
             <w:tcW w:w="540" w:type="dxa"/>
@@ -138,7 +149,7 @@
               <w:bottom w:val="single" w:sz="4" w:space="0" w:color="1A2B4A"/>
               <w:right w:val="single" w:sz="4" w:space="0" w:color="1A2B4A"/>
             </w:tcBorders>
-            <w:shd w:val="clear" w:color="auto" w:fill="1A2B4A"/>
+            <w:shd w:val="clear" w:color="auto" w:fill="4C94D8" w:themeFill="text2" w:themeFillTint="80"/>
             <w:tcMar>
               <w:top w:w="42" w:type="dxa"/>
               <w:left w:w="60" w:type="dxa"/>
@@ -169,7 +180,7 @@
               <w:bottom w:val="single" w:sz="4" w:space="0" w:color="028090"/>
               <w:right w:val="single" w:sz="4" w:space="0" w:color="028090"/>
             </w:tcBorders>
-            <w:shd w:val="clear" w:color="auto" w:fill="028090"/>
+            <w:shd w:val="clear" w:color="auto" w:fill="153D63" w:themeFill="text2" w:themeFillTint="E6"/>
             <w:tcMar>
               <w:top w:w="42" w:type="dxa"/>
               <w:left w:w="120" w:type="dxa"/>
@@ -220,12 +231,6 @@
         <w:gridCol w:w="4790"/>
       </w:tblGrid>
       <w:tr>
-        <w:tblPrEx>
-          <w:tblCellMar>
-            <w:top w:w="0" w:type="dxa"/>
-            <w:bottom w:w="0" w:type="dxa"/>
-          </w:tblCellMar>
-        </w:tblPrEx>
         <w:tc>
           <w:tcPr>
             <w:tcW w:w="5133" w:type="dxa"/>
@@ -501,6 +506,7 @@
               </w:rPr>
               <w:t xml:space="preserve">Customer </w:t>
             </w:r>
+            <w:proofErr w:type="gramStart"/>
             <w:r>
               <w:rPr>
                 <w:i/>
@@ -515,7 +521,52 @@
                 <w:iCs/>
                 <w:color w:val="64748B"/>
               </w:rPr>
-              <w:t xml:space="preserve">  /  Product Usage  /  Operational Efficiency  /  Business Model Innovation</w:t>
+              <w:t xml:space="preserve">  /</w:t>
+            </w:r>
+            <w:proofErr w:type="gramEnd"/>
+            <w:r>
+              <w:rPr>
+                <w:i/>
+                <w:iCs/>
+                <w:color w:val="64748B"/>
+              </w:rPr>
+              <w:t xml:space="preserve">  Product </w:t>
+            </w:r>
+            <w:proofErr w:type="gramStart"/>
+            <w:r>
+              <w:rPr>
+                <w:i/>
+                <w:iCs/>
+                <w:color w:val="64748B"/>
+              </w:rPr>
+              <w:t>Usage  /</w:t>
+            </w:r>
+            <w:proofErr w:type="gramEnd"/>
+            <w:r>
+              <w:rPr>
+                <w:i/>
+                <w:iCs/>
+                <w:color w:val="64748B"/>
+              </w:rPr>
+              <w:t xml:space="preserve">  Operational </w:t>
+            </w:r>
+            <w:proofErr w:type="gramStart"/>
+            <w:r>
+              <w:rPr>
+                <w:i/>
+                <w:iCs/>
+                <w:color w:val="64748B"/>
+              </w:rPr>
+              <w:t>Efficiency  /</w:t>
+            </w:r>
+            <w:proofErr w:type="gramEnd"/>
+            <w:r>
+              <w:rPr>
+                <w:i/>
+                <w:iCs/>
+                <w:color w:val="64748B"/>
+              </w:rPr>
+              <w:t xml:space="preserve">  Business Model Innovation</w:t>
             </w:r>
           </w:p>
         </w:tc>
@@ -704,12 +755,6 @@
         <w:gridCol w:w="8820"/>
       </w:tblGrid>
       <w:tr>
-        <w:tblPrEx>
-          <w:tblCellMar>
-            <w:top w:w="0" w:type="dxa"/>
-            <w:bottom w:w="0" w:type="dxa"/>
-          </w:tblCellMar>
-        </w:tblPrEx>
         <w:tc>
           <w:tcPr>
             <w:tcW w:w="540" w:type="dxa"/>
@@ -719,7 +764,7 @@
               <w:bottom w:val="single" w:sz="4" w:space="0" w:color="1A2B4A"/>
               <w:right w:val="single" w:sz="4" w:space="0" w:color="1A2B4A"/>
             </w:tcBorders>
-            <w:shd w:val="clear" w:color="auto" w:fill="1A2B4A"/>
+            <w:shd w:val="clear" w:color="auto" w:fill="4C94D8" w:themeFill="text2" w:themeFillTint="80"/>
             <w:tcMar>
               <w:top w:w="42" w:type="dxa"/>
               <w:left w:w="60" w:type="dxa"/>
@@ -750,7 +795,7 @@
               <w:bottom w:val="single" w:sz="4" w:space="0" w:color="028090"/>
               <w:right w:val="single" w:sz="4" w:space="0" w:color="028090"/>
             </w:tcBorders>
-            <w:shd w:val="clear" w:color="auto" w:fill="028090"/>
+            <w:shd w:val="clear" w:color="auto" w:fill="153D63" w:themeFill="text2" w:themeFillTint="E6"/>
             <w:tcMar>
               <w:top w:w="42" w:type="dxa"/>
               <w:left w:w="120" w:type="dxa"/>
@@ -797,12 +842,6 @@
         <w:gridCol w:w="15438"/>
       </w:tblGrid>
       <w:tr>
-        <w:tblPrEx>
-          <w:tblCellMar>
-            <w:top w:w="0" w:type="dxa"/>
-            <w:bottom w:w="0" w:type="dxa"/>
-          </w:tblCellMar>
-        </w:tblPrEx>
         <w:tc>
           <w:tcPr>
             <w:tcW w:w="15438" w:type="dxa"/>
@@ -830,7 +869,25 @@
                 <w:iCs/>
                 <w:color w:val="64748B"/>
               </w:rPr>
-              <w:t>Describe the business domain in plain language. Who are the key actors? What do they do? What does the business track, measure, and manage? What business rules and constraints apply? Write 3-6 sentences. The data modeler will derive entities and attributes from this narrative.</w:t>
+              <w:t xml:space="preserve">Describe the business domain in plain language. Who are the key actors? What do they do? What does </w:t>
+            </w:r>
+            <w:proofErr w:type="gramStart"/>
+            <w:r>
+              <w:rPr>
+                <w:i/>
+                <w:iCs/>
+                <w:color w:val="64748B"/>
+              </w:rPr>
+              <w:t>the business</w:t>
+            </w:r>
+            <w:proofErr w:type="gramEnd"/>
+            <w:r>
+              <w:rPr>
+                <w:i/>
+                <w:iCs/>
+                <w:color w:val="64748B"/>
+              </w:rPr>
+              <w:t xml:space="preserve"> track, measure, and manage? What business rules and constraints apply? Write 3-6 sentences. The data modeler will derive entities and attributes from this narrative.</w:t>
             </w:r>
           </w:p>
           <w:p>
@@ -883,12 +940,6 @@
         <w:gridCol w:w="8820"/>
       </w:tblGrid>
       <w:tr>
-        <w:tblPrEx>
-          <w:tblCellMar>
-            <w:top w:w="0" w:type="dxa"/>
-            <w:bottom w:w="0" w:type="dxa"/>
-          </w:tblCellMar>
-        </w:tblPrEx>
         <w:tc>
           <w:tcPr>
             <w:tcW w:w="540" w:type="dxa"/>
@@ -898,7 +949,7 @@
               <w:bottom w:val="single" w:sz="4" w:space="0" w:color="1A2B4A"/>
               <w:right w:val="single" w:sz="4" w:space="0" w:color="1A2B4A"/>
             </w:tcBorders>
-            <w:shd w:val="clear" w:color="auto" w:fill="1A2B4A"/>
+            <w:shd w:val="clear" w:color="auto" w:fill="4C94D8" w:themeFill="text2" w:themeFillTint="80"/>
             <w:tcMar>
               <w:top w:w="42" w:type="dxa"/>
               <w:left w:w="60" w:type="dxa"/>
@@ -929,7 +980,7 @@
               <w:bottom w:val="single" w:sz="4" w:space="0" w:color="028090"/>
               <w:right w:val="single" w:sz="4" w:space="0" w:color="028090"/>
             </w:tcBorders>
-            <w:shd w:val="clear" w:color="auto" w:fill="028090"/>
+            <w:shd w:val="clear" w:color="auto" w:fill="153D63" w:themeFill="text2" w:themeFillTint="E6"/>
             <w:tcMar>
               <w:top w:w="42" w:type="dxa"/>
               <w:left w:w="120" w:type="dxa"/>
@@ -982,12 +1033,6 @@
         <w:gridCol w:w="685"/>
       </w:tblGrid>
       <w:tr>
-        <w:tblPrEx>
-          <w:tblCellMar>
-            <w:top w:w="0" w:type="dxa"/>
-            <w:bottom w:w="0" w:type="dxa"/>
-          </w:tblCellMar>
-        </w:tblPrEx>
         <w:trPr>
           <w:tblHeader/>
         </w:trPr>
@@ -1000,7 +1045,7 @@
               <w:bottom w:val="single" w:sz="4" w:space="0" w:color="028090"/>
               <w:right w:val="single" w:sz="4" w:space="0" w:color="028090"/>
             </w:tcBorders>
-            <w:shd w:val="clear" w:color="auto" w:fill="028090"/>
+            <w:shd w:val="clear" w:color="auto" w:fill="153D63" w:themeFill="text2" w:themeFillTint="E6"/>
             <w:tcMar>
               <w:top w:w="52" w:type="dxa"/>
               <w:left w:w="108" w:type="dxa"/>
@@ -1033,7 +1078,7 @@
               <w:bottom w:val="single" w:sz="4" w:space="0" w:color="028090"/>
               <w:right w:val="single" w:sz="4" w:space="0" w:color="028090"/>
             </w:tcBorders>
-            <w:shd w:val="clear" w:color="auto" w:fill="028090"/>
+            <w:shd w:val="clear" w:color="auto" w:fill="153D63" w:themeFill="text2" w:themeFillTint="E6"/>
             <w:tcMar>
               <w:top w:w="52" w:type="dxa"/>
               <w:left w:w="108" w:type="dxa"/>
@@ -1085,7 +1130,7 @@
               <w:bottom w:val="single" w:sz="4" w:space="0" w:color="028090"/>
               <w:right w:val="single" w:sz="4" w:space="0" w:color="028090"/>
             </w:tcBorders>
-            <w:shd w:val="clear" w:color="auto" w:fill="028090"/>
+            <w:shd w:val="clear" w:color="auto" w:fill="153D63" w:themeFill="text2" w:themeFillTint="E6"/>
             <w:tcMar>
               <w:top w:w="52" w:type="dxa"/>
               <w:left w:w="108" w:type="dxa"/>
@@ -1118,7 +1163,7 @@
               <w:bottom w:val="single" w:sz="4" w:space="0" w:color="028090"/>
               <w:right w:val="single" w:sz="4" w:space="0" w:color="028090"/>
             </w:tcBorders>
-            <w:shd w:val="clear" w:color="auto" w:fill="028090"/>
+            <w:shd w:val="clear" w:color="auto" w:fill="153D63" w:themeFill="text2" w:themeFillTint="E6"/>
             <w:tcMar>
               <w:top w:w="52" w:type="dxa"/>
               <w:left w:w="108" w:type="dxa"/>
@@ -1151,7 +1196,7 @@
               <w:bottom w:val="single" w:sz="4" w:space="0" w:color="028090"/>
               <w:right w:val="single" w:sz="4" w:space="0" w:color="028090"/>
             </w:tcBorders>
-            <w:shd w:val="clear" w:color="auto" w:fill="028090"/>
+            <w:shd w:val="clear" w:color="auto" w:fill="153D63" w:themeFill="text2" w:themeFillTint="E6"/>
             <w:tcMar>
               <w:top w:w="52" w:type="dxa"/>
               <w:left w:w="108" w:type="dxa"/>
@@ -1184,7 +1229,7 @@
               <w:bottom w:val="single" w:sz="4" w:space="0" w:color="028090"/>
               <w:right w:val="single" w:sz="4" w:space="0" w:color="028090"/>
             </w:tcBorders>
-            <w:shd w:val="clear" w:color="auto" w:fill="028090"/>
+            <w:shd w:val="clear" w:color="auto" w:fill="153D63" w:themeFill="text2" w:themeFillTint="E6"/>
             <w:tcMar>
               <w:top w:w="52" w:type="dxa"/>
               <w:left w:w="108" w:type="dxa"/>
@@ -1222,12 +1267,6 @@
         </w:tc>
       </w:tr>
       <w:tr>
-        <w:tblPrEx>
-          <w:tblCellMar>
-            <w:top w:w="0" w:type="dxa"/>
-            <w:bottom w:w="0" w:type="dxa"/>
-          </w:tblCellMar>
-        </w:tblPrEx>
         <w:tc>
           <w:tcPr>
             <w:tcW w:w="2655" w:type="dxa"/>
@@ -1361,6 +1400,7 @@
             <w:pPr>
               <w:spacing w:after="60"/>
             </w:pPr>
+            <w:proofErr w:type="gramStart"/>
             <w:r>
               <w:rPr>
                 <w:i/>
@@ -1369,6 +1409,7 @@
               </w:rPr>
               <w:t>1:N</w:t>
             </w:r>
+            <w:proofErr w:type="gramEnd"/>
           </w:p>
         </w:tc>
         <w:tc>
@@ -1435,12 +1476,6 @@
         </w:tc>
       </w:tr>
       <w:tr>
-        <w:tblPrEx>
-          <w:tblCellMar>
-            <w:top w:w="0" w:type="dxa"/>
-            <w:bottom w:w="0" w:type="dxa"/>
-          </w:tblCellMar>
-        </w:tblPrEx>
         <w:tc>
           <w:tcPr>
             <w:tcW w:w="2655" w:type="dxa"/>
@@ -1558,6 +1593,7 @@
             <w:pPr>
               <w:spacing w:after="60"/>
             </w:pPr>
+            <w:proofErr w:type="gramStart"/>
             <w:r>
               <w:rPr>
                 <w:i/>
@@ -1566,6 +1602,7 @@
               </w:rPr>
               <w:t>1:N</w:t>
             </w:r>
+            <w:proofErr w:type="gramEnd"/>
           </w:p>
         </w:tc>
         <w:tc>
@@ -1632,12 +1669,6 @@
         </w:tc>
       </w:tr>
       <w:tr>
-        <w:tblPrEx>
-          <w:tblCellMar>
-            <w:top w:w="0" w:type="dxa"/>
-            <w:bottom w:w="0" w:type="dxa"/>
-          </w:tblCellMar>
-        </w:tblPrEx>
         <w:tc>
           <w:tcPr>
             <w:tcW w:w="2655" w:type="dxa"/>
@@ -1829,12 +1860,6 @@
         </w:tc>
       </w:tr>
       <w:tr>
-        <w:tblPrEx>
-          <w:tblCellMar>
-            <w:top w:w="0" w:type="dxa"/>
-            <w:bottom w:w="0" w:type="dxa"/>
-          </w:tblCellMar>
-        </w:tblPrEx>
         <w:tc>
           <w:tcPr>
             <w:tcW w:w="2655" w:type="dxa"/>
@@ -1994,12 +2019,6 @@
         </w:tc>
       </w:tr>
       <w:tr>
-        <w:tblPrEx>
-          <w:tblCellMar>
-            <w:top w:w="0" w:type="dxa"/>
-            <w:bottom w:w="0" w:type="dxa"/>
-          </w:tblCellMar>
-        </w:tblPrEx>
         <w:tc>
           <w:tcPr>
             <w:tcW w:w="2655" w:type="dxa"/>
@@ -2092,17 +2111,39 @@
                 <w:sz w:val="16"/>
                 <w:szCs w:val="16"/>
               </w:rPr>
-              <w:t xml:space="preserve">Hierarchies / self-referencing:  </w:t>
-            </w:r>
-            <w:r>
-              <w:rPr>
-                <w:i/>
-                <w:iCs/>
-                <w:color w:val="64748B"/>
+              <w:t>Hierarchies / self-referencing</w:t>
+            </w:r>
+            <w:proofErr w:type="gramStart"/>
+            <w:r>
+              <w:rPr>
+                <w:b/>
+                <w:bCs/>
+                <w:color w:val="028090"/>
                 <w:sz w:val="16"/>
                 <w:szCs w:val="16"/>
               </w:rPr>
-              <w:t>e.g. Category &gt; Category (Root &gt; Mid &gt; Leaf, max 3 levels)</w:t>
+              <w:t xml:space="preserve">:  </w:t>
+            </w:r>
+            <w:r>
+              <w:rPr>
+                <w:i/>
+                <w:iCs/>
+                <w:color w:val="64748B"/>
+                <w:sz w:val="16"/>
+                <w:szCs w:val="16"/>
+              </w:rPr>
+              <w:t>e</w:t>
+            </w:r>
+            <w:proofErr w:type="gramEnd"/>
+            <w:r>
+              <w:rPr>
+                <w:i/>
+                <w:iCs/>
+                <w:color w:val="64748B"/>
+                <w:sz w:val="16"/>
+                <w:szCs w:val="16"/>
+              </w:rPr>
+              <w:t>.g. Category &gt; Category (Root &gt; Mid &gt; Leaf, max 3 levels)</w:t>
             </w:r>
           </w:p>
         </w:tc>
@@ -2135,12 +2176,6 @@
         <w:gridCol w:w="8820"/>
       </w:tblGrid>
       <w:tr>
-        <w:tblPrEx>
-          <w:tblCellMar>
-            <w:top w:w="0" w:type="dxa"/>
-            <w:bottom w:w="0" w:type="dxa"/>
-          </w:tblCellMar>
-        </w:tblPrEx>
         <w:tc>
           <w:tcPr>
             <w:tcW w:w="540" w:type="dxa"/>
@@ -2150,7 +2185,7 @@
               <w:bottom w:val="single" w:sz="4" w:space="0" w:color="1A2B4A"/>
               <w:right w:val="single" w:sz="4" w:space="0" w:color="1A2B4A"/>
             </w:tcBorders>
-            <w:shd w:val="clear" w:color="auto" w:fill="1A2B4A"/>
+            <w:shd w:val="clear" w:color="auto" w:fill="4C94D8" w:themeFill="text2" w:themeFillTint="80"/>
             <w:tcMar>
               <w:top w:w="42" w:type="dxa"/>
               <w:left w:w="60" w:type="dxa"/>
@@ -2181,7 +2216,7 @@
               <w:bottom w:val="single" w:sz="4" w:space="0" w:color="028090"/>
               <w:right w:val="single" w:sz="4" w:space="0" w:color="028090"/>
             </w:tcBorders>
-            <w:shd w:val="clear" w:color="auto" w:fill="028090"/>
+            <w:shd w:val="clear" w:color="auto" w:fill="153D63" w:themeFill="text2" w:themeFillTint="E6"/>
             <w:tcMar>
               <w:top w:w="42" w:type="dxa"/>
               <w:left w:w="120" w:type="dxa"/>
@@ -2232,12 +2267,6 @@
         <w:gridCol w:w="5112"/>
       </w:tblGrid>
       <w:tr>
-        <w:tblPrEx>
-          <w:tblCellMar>
-            <w:top w:w="0" w:type="dxa"/>
-            <w:bottom w:w="0" w:type="dxa"/>
-          </w:tblCellMar>
-        </w:tblPrEx>
         <w:tc>
           <w:tcPr>
             <w:tcW w:w="4956" w:type="dxa"/>
@@ -2306,6 +2335,7 @@
               </w:rPr>
             </w:pPr>
             <w:proofErr w:type="spellStart"/>
+            <w:proofErr w:type="gramStart"/>
             <w:r>
               <w:rPr>
                 <w:b/>
@@ -2325,7 +2355,17 @@
                 <w:szCs w:val="15"/>
                 <w:lang w:val="fr-BE"/>
               </w:rPr>
-              <w:t xml:space="preserve">  /  Classification</w:t>
+              <w:t xml:space="preserve">  /</w:t>
+            </w:r>
+            <w:proofErr w:type="gramEnd"/>
+            <w:r>
+              <w:rPr>
+                <w:color w:val="E85D04"/>
+                <w:sz w:val="15"/>
+                <w:szCs w:val="15"/>
+                <w:lang w:val="fr-BE"/>
+              </w:rPr>
+              <w:t xml:space="preserve">  Classification</w:t>
             </w:r>
           </w:p>
           <w:p>
@@ -2350,7 +2390,27 @@
                 <w:color w:val="64748B"/>
                 <w:lang w:val="fr-BE"/>
               </w:rPr>
-              <w:t>e.g. Email  /  PII</w:t>
+              <w:t xml:space="preserve">e.g. </w:t>
+            </w:r>
+            <w:proofErr w:type="gramStart"/>
+            <w:r>
+              <w:rPr>
+                <w:i/>
+                <w:iCs/>
+                <w:color w:val="64748B"/>
+                <w:lang w:val="fr-BE"/>
+              </w:rPr>
+              <w:t>Email  /</w:t>
+            </w:r>
+            <w:proofErr w:type="gramEnd"/>
+            <w:r>
+              <w:rPr>
+                <w:i/>
+                <w:iCs/>
+                <w:color w:val="64748B"/>
+                <w:lang w:val="fr-BE"/>
+              </w:rPr>
+              <w:t xml:space="preserve">  PII</w:t>
             </w:r>
           </w:p>
           <w:p>
@@ -2653,13 +2713,77 @@
               </w:numPr>
               <w:spacing w:after="16"/>
             </w:pPr>
+            <w:proofErr w:type="gramStart"/>
             <w:r>
               <w:rPr>
                 <w:color w:val="1E293B"/>
                 <w:sz w:val="17"/>
                 <w:szCs w:val="17"/>
               </w:rPr>
-              <w:t>[ ] Conceptual    [ ] Logical (3NF)    [ ] Physical</w:t>
+              <w:t>[ ]</w:t>
+            </w:r>
+            <w:proofErr w:type="gramEnd"/>
+            <w:r>
+              <w:rPr>
+                <w:color w:val="1E293B"/>
+                <w:sz w:val="17"/>
+                <w:szCs w:val="17"/>
+              </w:rPr>
+              <w:t xml:space="preserve"> Conceptual </w:t>
+            </w:r>
+            <w:proofErr w:type="gramStart"/>
+            <w:r>
+              <w:rPr>
+                <w:color w:val="1E293B"/>
+                <w:sz w:val="17"/>
+                <w:szCs w:val="17"/>
+              </w:rPr>
+              <w:t xml:space="preserve">   [</w:t>
+            </w:r>
+            <w:proofErr w:type="gramEnd"/>
+            <w:r>
+              <w:rPr>
+                <w:color w:val="1E293B"/>
+                <w:sz w:val="17"/>
+                <w:szCs w:val="17"/>
+              </w:rPr>
+              <w:t xml:space="preserve"> ] Logical (3</w:t>
+            </w:r>
+            <w:proofErr w:type="gramStart"/>
+            <w:r>
+              <w:rPr>
+                <w:color w:val="1E293B"/>
+                <w:sz w:val="17"/>
+                <w:szCs w:val="17"/>
+              </w:rPr>
+              <w:t xml:space="preserve">NF)   </w:t>
+            </w:r>
+            <w:proofErr w:type="gramEnd"/>
+            <w:r>
+              <w:rPr>
+                <w:color w:val="1E293B"/>
+                <w:sz w:val="17"/>
+                <w:szCs w:val="17"/>
+              </w:rPr>
+              <w:t xml:space="preserve"> </w:t>
+            </w:r>
+            <w:proofErr w:type="gramStart"/>
+            <w:r>
+              <w:rPr>
+                <w:color w:val="1E293B"/>
+                <w:sz w:val="17"/>
+                <w:szCs w:val="17"/>
+              </w:rPr>
+              <w:t>[ ]</w:t>
+            </w:r>
+            <w:proofErr w:type="gramEnd"/>
+            <w:r>
+              <w:rPr>
+                <w:color w:val="1E293B"/>
+                <w:sz w:val="17"/>
+                <w:szCs w:val="17"/>
+              </w:rPr>
+              <w:t xml:space="preserve"> Physical</w:t>
             </w:r>
           </w:p>
           <w:p>
@@ -2691,13 +2815,41 @@
               </w:numPr>
               <w:spacing w:after="16"/>
             </w:pPr>
+            <w:proofErr w:type="gramStart"/>
             <w:r>
               <w:rPr>
                 <w:color w:val="1E293B"/>
                 <w:sz w:val="17"/>
                 <w:szCs w:val="17"/>
               </w:rPr>
-              <w:t>[ ] Natural keys    [ ] Surrogate keys (UUID)</w:t>
+              <w:t>[ ]</w:t>
+            </w:r>
+            <w:proofErr w:type="gramEnd"/>
+            <w:r>
+              <w:rPr>
+                <w:color w:val="1E293B"/>
+                <w:sz w:val="17"/>
+                <w:szCs w:val="17"/>
+              </w:rPr>
+              <w:t xml:space="preserve"> Natural keys </w:t>
+            </w:r>
+            <w:proofErr w:type="gramStart"/>
+            <w:r>
+              <w:rPr>
+                <w:color w:val="1E293B"/>
+                <w:sz w:val="17"/>
+                <w:szCs w:val="17"/>
+              </w:rPr>
+              <w:t xml:space="preserve">   [</w:t>
+            </w:r>
+            <w:proofErr w:type="gramEnd"/>
+            <w:r>
+              <w:rPr>
+                <w:color w:val="1E293B"/>
+                <w:sz w:val="17"/>
+                <w:szCs w:val="17"/>
+              </w:rPr>
+              <w:t xml:space="preserve"> ] Surrogate keys (UUID)</w:t>
             </w:r>
           </w:p>
           <w:p>
@@ -2729,13 +2881,59 @@
               </w:numPr>
               <w:spacing w:after="16"/>
             </w:pPr>
+            <w:proofErr w:type="gramStart"/>
             <w:r>
               <w:rPr>
                 <w:color w:val="1E293B"/>
                 <w:sz w:val="17"/>
                 <w:szCs w:val="17"/>
               </w:rPr>
-              <w:t>[ ] Type 1 (overwrite)    [ ] Type 2 (history)</w:t>
+              <w:t>[ ]</w:t>
+            </w:r>
+            <w:proofErr w:type="gramEnd"/>
+            <w:r>
+              <w:rPr>
+                <w:color w:val="1E293B"/>
+                <w:sz w:val="17"/>
+                <w:szCs w:val="17"/>
+              </w:rPr>
+              <w:t xml:space="preserve"> Type 1 (</w:t>
+            </w:r>
+            <w:proofErr w:type="gramStart"/>
+            <w:r>
+              <w:rPr>
+                <w:color w:val="1E293B"/>
+                <w:sz w:val="17"/>
+                <w:szCs w:val="17"/>
+              </w:rPr>
+              <w:t xml:space="preserve">overwrite)   </w:t>
+            </w:r>
+            <w:proofErr w:type="gramEnd"/>
+            <w:r>
+              <w:rPr>
+                <w:color w:val="1E293B"/>
+                <w:sz w:val="17"/>
+                <w:szCs w:val="17"/>
+              </w:rPr>
+              <w:t xml:space="preserve"> </w:t>
+            </w:r>
+            <w:proofErr w:type="gramStart"/>
+            <w:r>
+              <w:rPr>
+                <w:color w:val="1E293B"/>
+                <w:sz w:val="17"/>
+                <w:szCs w:val="17"/>
+              </w:rPr>
+              <w:t>[ ]</w:t>
+            </w:r>
+            <w:proofErr w:type="gramEnd"/>
+            <w:r>
+              <w:rPr>
+                <w:color w:val="1E293B"/>
+                <w:sz w:val="17"/>
+                <w:szCs w:val="17"/>
+              </w:rPr>
+              <w:t xml:space="preserve"> Type 2 (history)</w:t>
             </w:r>
           </w:p>
           <w:p>
@@ -2801,12 +2999,6 @@
         <w:gridCol w:w="8820"/>
       </w:tblGrid>
       <w:tr>
-        <w:tblPrEx>
-          <w:tblCellMar>
-            <w:top w:w="0" w:type="dxa"/>
-            <w:bottom w:w="0" w:type="dxa"/>
-          </w:tblCellMar>
-        </w:tblPrEx>
         <w:tc>
           <w:tcPr>
             <w:tcW w:w="540" w:type="dxa"/>
@@ -2816,7 +3008,7 @@
               <w:bottom w:val="single" w:sz="4" w:space="0" w:color="1A2B4A"/>
               <w:right w:val="single" w:sz="4" w:space="0" w:color="1A2B4A"/>
             </w:tcBorders>
-            <w:shd w:val="clear" w:color="auto" w:fill="1A2B4A"/>
+            <w:shd w:val="clear" w:color="auto" w:fill="4C94D8" w:themeFill="text2" w:themeFillTint="80"/>
             <w:tcMar>
               <w:top w:w="42" w:type="dxa"/>
               <w:left w:w="60" w:type="dxa"/>
@@ -2847,7 +3039,7 @@
               <w:bottom w:val="single" w:sz="4" w:space="0" w:color="028090"/>
               <w:right w:val="single" w:sz="4" w:space="0" w:color="028090"/>
             </w:tcBorders>
-            <w:shd w:val="clear" w:color="auto" w:fill="028090"/>
+            <w:shd w:val="clear" w:color="auto" w:fill="153D63" w:themeFill="text2" w:themeFillTint="E6"/>
             <w:tcMar>
               <w:top w:w="42" w:type="dxa"/>
               <w:left w:w="120" w:type="dxa"/>
@@ -2896,12 +3088,6 @@
         <w:gridCol w:w="7533"/>
       </w:tblGrid>
       <w:tr>
-        <w:tblPrEx>
-          <w:tblCellMar>
-            <w:top w:w="0" w:type="dxa"/>
-            <w:bottom w:w="0" w:type="dxa"/>
-          </w:tblCellMar>
-        </w:tblPrEx>
         <w:tc>
           <w:tcPr>
             <w:tcW w:w="5113" w:type="dxa"/>
@@ -2949,7 +3135,25 @@
                 <w:iCs/>
                 <w:color w:val="64748B"/>
               </w:rPr>
-              <w:t>1.  e.g. Revenue per customer per channel per month</w:t>
+              <w:t>1</w:t>
+            </w:r>
+            <w:proofErr w:type="gramStart"/>
+            <w:r>
+              <w:rPr>
+                <w:i/>
+                <w:iCs/>
+                <w:color w:val="64748B"/>
+              </w:rPr>
+              <w:t>.  e</w:t>
+            </w:r>
+            <w:proofErr w:type="gramEnd"/>
+            <w:r>
+              <w:rPr>
+                <w:i/>
+                <w:iCs/>
+                <w:color w:val="64748B"/>
+              </w:rPr>
+              <w:t>.g. Revenue per customer per channel per month</w:t>
             </w:r>
           </w:p>
           <w:p>
@@ -2967,7 +3171,25 @@
                 <w:iCs/>
                 <w:color w:val="64748B"/>
               </w:rPr>
-              <w:t>2.  e.g. Customer lifetime value at any historical date</w:t>
+              <w:t>2</w:t>
+            </w:r>
+            <w:proofErr w:type="gramStart"/>
+            <w:r>
+              <w:rPr>
+                <w:i/>
+                <w:iCs/>
+                <w:color w:val="64748B"/>
+              </w:rPr>
+              <w:t>.  e</w:t>
+            </w:r>
+            <w:proofErr w:type="gramEnd"/>
+            <w:r>
+              <w:rPr>
+                <w:i/>
+                <w:iCs/>
+                <w:color w:val="64748B"/>
+              </w:rPr>
+              <w:t>.g. Customer lifetime value at any historical date</w:t>
             </w:r>
           </w:p>
           <w:p>
@@ -2985,7 +3207,25 @@
                 <w:iCs/>
                 <w:color w:val="64748B"/>
               </w:rPr>
-              <w:t>3.  e.g. Gross margin per product category</w:t>
+              <w:t>3</w:t>
+            </w:r>
+            <w:proofErr w:type="gramStart"/>
+            <w:r>
+              <w:rPr>
+                <w:i/>
+                <w:iCs/>
+                <w:color w:val="64748B"/>
+              </w:rPr>
+              <w:t>.  e</w:t>
+            </w:r>
+            <w:proofErr w:type="gramEnd"/>
+            <w:r>
+              <w:rPr>
+                <w:i/>
+                <w:iCs/>
+                <w:color w:val="64748B"/>
+              </w:rPr>
+              <w:t>.g. Gross margin per product category</w:t>
             </w:r>
           </w:p>
           <w:p>
@@ -3003,7 +3243,25 @@
                 <w:iCs/>
                 <w:color w:val="64748B"/>
               </w:rPr>
-              <w:t>4.  e.g. Promotional discount vs. baseline revenue</w:t>
+              <w:t>4</w:t>
+            </w:r>
+            <w:proofErr w:type="gramStart"/>
+            <w:r>
+              <w:rPr>
+                <w:i/>
+                <w:iCs/>
+                <w:color w:val="64748B"/>
+              </w:rPr>
+              <w:t>.  e</w:t>
+            </w:r>
+            <w:proofErr w:type="gramEnd"/>
+            <w:r>
+              <w:rPr>
+                <w:i/>
+                <w:iCs/>
+                <w:color w:val="64748B"/>
+              </w:rPr>
+              <w:t>.g. Promotional discount vs. baseline revenue</w:t>
             </w:r>
           </w:p>
         </w:tc>
@@ -3067,13 +3325,23 @@
             <w:pPr>
               <w:spacing w:after="60"/>
             </w:pPr>
-            <w:r>
-              <w:rPr>
-                <w:i/>
-                <w:iCs/>
-                <w:color w:val="64748B"/>
-              </w:rPr>
-              <w:t>[ ]  Conceptual diagram with all entities and relationships</w:t>
+            <w:proofErr w:type="gramStart"/>
+            <w:r>
+              <w:rPr>
+                <w:i/>
+                <w:iCs/>
+                <w:color w:val="64748B"/>
+              </w:rPr>
+              <w:t>[ ]</w:t>
+            </w:r>
+            <w:proofErr w:type="gramEnd"/>
+            <w:r>
+              <w:rPr>
+                <w:i/>
+                <w:iCs/>
+                <w:color w:val="64748B"/>
+              </w:rPr>
+              <w:t xml:space="preserve">  Conceptual diagram with all entities and relationships</w:t>
             </w:r>
           </w:p>
           <w:p>
@@ -3085,13 +3353,23 @@
             <w:pPr>
               <w:spacing w:after="60"/>
             </w:pPr>
-            <w:r>
-              <w:rPr>
-                <w:i/>
-                <w:iCs/>
-                <w:color w:val="64748B"/>
-              </w:rPr>
-              <w:t>[ ]  Logical model in 3NF with PK/FK constraints and governance notes</w:t>
+            <w:proofErr w:type="gramStart"/>
+            <w:r>
+              <w:rPr>
+                <w:i/>
+                <w:iCs/>
+                <w:color w:val="64748B"/>
+              </w:rPr>
+              <w:t>[ ]</w:t>
+            </w:r>
+            <w:proofErr w:type="gramEnd"/>
+            <w:r>
+              <w:rPr>
+                <w:i/>
+                <w:iCs/>
+                <w:color w:val="64748B"/>
+              </w:rPr>
+              <w:t xml:space="preserve">  Logical model in 3NF with PK/FK constraints and governance notes</w:t>
             </w:r>
           </w:p>
           <w:p>
@@ -3103,13 +3381,41 @@
             <w:pPr>
               <w:spacing w:after="60"/>
             </w:pPr>
-            <w:r>
-              <w:rPr>
-                <w:i/>
-                <w:iCs/>
-                <w:color w:val="64748B"/>
-              </w:rPr>
-              <w:t>[ ]  Physical model forward-engineered to valid DDL / DBML</w:t>
+            <w:proofErr w:type="gramStart"/>
+            <w:r>
+              <w:rPr>
+                <w:i/>
+                <w:iCs/>
+                <w:color w:val="64748B"/>
+              </w:rPr>
+              <w:t>[ ]</w:t>
+            </w:r>
+            <w:proofErr w:type="gramEnd"/>
+            <w:r>
+              <w:rPr>
+                <w:i/>
+                <w:iCs/>
+                <w:color w:val="64748B"/>
+              </w:rPr>
+              <w:t xml:space="preserve">  Physical model </w:t>
+            </w:r>
+            <w:proofErr w:type="gramStart"/>
+            <w:r>
+              <w:rPr>
+                <w:i/>
+                <w:iCs/>
+                <w:color w:val="64748B"/>
+              </w:rPr>
+              <w:t>forward-engineered</w:t>
+            </w:r>
+            <w:proofErr w:type="gramEnd"/>
+            <w:r>
+              <w:rPr>
+                <w:i/>
+                <w:iCs/>
+                <w:color w:val="64748B"/>
+              </w:rPr>
+              <w:t xml:space="preserve"> to valid DDL / DBML</w:t>
             </w:r>
           </w:p>
           <w:p>
@@ -3121,13 +3427,23 @@
             <w:pPr>
               <w:spacing w:after="60"/>
             </w:pPr>
-            <w:r>
-              <w:rPr>
-                <w:i/>
-                <w:iCs/>
-                <w:color w:val="64748B"/>
-              </w:rPr>
-              <w:t>[ ]  All PII attributes classified and annotated in the model</w:t>
+            <w:proofErr w:type="gramStart"/>
+            <w:r>
+              <w:rPr>
+                <w:i/>
+                <w:iCs/>
+                <w:color w:val="64748B"/>
+              </w:rPr>
+              <w:t>[ ]</w:t>
+            </w:r>
+            <w:proofErr w:type="gramEnd"/>
+            <w:r>
+              <w:rPr>
+                <w:i/>
+                <w:iCs/>
+                <w:color w:val="64748B"/>
+              </w:rPr>
+              <w:t xml:space="preserve">  All PII attributes classified and annotated in the model</w:t>
             </w:r>
           </w:p>
         </w:tc>
@@ -3468,7 +3784,43 @@
         <w:sz w:val="14"/>
         <w:szCs w:val="14"/>
       </w:rPr>
-      <w:t xml:space="preserve">Hackolade Studio  |  hackolade.com  |  Page </w:t>
+      <w:t xml:space="preserve">Hackolade </w:t>
+    </w:r>
+    <w:proofErr w:type="gramStart"/>
+    <w:r>
+      <w:rPr>
+        <w:color w:val="64748B"/>
+        <w:sz w:val="14"/>
+        <w:szCs w:val="14"/>
+      </w:rPr>
+      <w:t>Studio  |</w:t>
+    </w:r>
+    <w:proofErr w:type="gramEnd"/>
+    <w:r>
+      <w:rPr>
+        <w:color w:val="64748B"/>
+        <w:sz w:val="14"/>
+        <w:szCs w:val="14"/>
+      </w:rPr>
+      <w:t xml:space="preserve">  </w:t>
+    </w:r>
+    <w:proofErr w:type="gramStart"/>
+    <w:r>
+      <w:rPr>
+        <w:color w:val="64748B"/>
+        <w:sz w:val="14"/>
+        <w:szCs w:val="14"/>
+      </w:rPr>
+      <w:t>hackolade.com  |</w:t>
+    </w:r>
+    <w:proofErr w:type="gramEnd"/>
+    <w:r>
+      <w:rPr>
+        <w:color w:val="64748B"/>
+        <w:sz w:val="14"/>
+        <w:szCs w:val="14"/>
+      </w:rPr>
+      <w:t xml:space="preserve">  Page </w:t>
     </w:r>
     <w:r>
       <w:rPr>
@@ -3607,12 +3959,6 @@
       <w:gridCol w:w="3894"/>
     </w:tblGrid>
     <w:tr>
-      <w:tblPrEx>
-        <w:tblCellMar>
-          <w:top w:w="0" w:type="dxa"/>
-          <w:bottom w:w="0" w:type="dxa"/>
-        </w:tblCellMar>
-      </w:tblPrEx>
       <w:tc>
         <w:tcPr>
           <w:tcW w:w="7826" w:type="dxa"/>

</xml_diff>